<commit_message>
Add Zenodo DOIs (concept 10.5281/zenodo.23302897, v0.1.0 10.5281/zenodo.23302898)
</commit_message>
<xml_diff>
--- a/paper/VGL_v0.1_Technical_Report.docx
+++ b/paper/VGL_v0.1_Technical_Report.docx
@@ -57,7 +57,7 @@
           <w:sz w:val="22"/>
           <w:szCs w:val="22"/>
         </w:rPr>
-        <w:t xml:space="preserve">Technical report. Version 0.1.0. Sources accessed 2026-10-11. Archived on Zenodo; DOI on the Zenodo record.</w:t>
+        <w:t xml:space="preserve">Technical report. Version 0.1.0. Sources accessed 2026-10-11. DOI https://doi.org/10.5281/zenodo.23302898.</w:t>
       </w:r>
     </w:p>
     <w:p>
@@ -4569,7 +4569,7 @@
           <w:sz w:val="22"/>
           <w:szCs w:val="22"/>
         </w:rPr>
-        <w:t xml:space="preserve">All tables, evidence, code, and this report are available under CC BY 4.0 (data and documents) and MIT (code) at https://github.com/Olumide-Akindipe/verification-gap-ledger and archived at Zenodo.</w:t>
+        <w:t xml:space="preserve">All tables, evidence, code, and this report are available under CC BY 4.0 (data and documents) and MIT (code) at https://github.com/Olumide-Akindipe/verification-gap-ledger and archived at Zenodo: version DOI https://doi.org/10.5281/zenodo.23302898; concept DOI for all versions https://doi.org/10.5281/zenodo.23302897.</w:t>
       </w:r>
     </w:p>
     <w:sectPr>

</xml_diff>